<commit_message>
Worked on multiple matter UI and filled in more data.
</commit_message>
<xml_diff>
--- a/project/documents/communications/corrappln.docx
+++ b/project/documents/communications/corrappln.docx
@@ -827,7 +827,7 @@
           <w:szCs w:val="18"/>
         </w:rPr>
         <w:pict w14:anchorId="1942FA60">
-          <v:line id="_x0000_s1031" style="position:absolute;z-index:251657216" from="1.05pt,.1pt" to="211.05pt,.1pt"/>
+          <v:line id="_x0000_s1031" style="position:absolute;z-index:2" from="1.05pt,.1pt" to="211.05pt,.1pt"/>
         </w:pict>
       </w:r>
       <w:r>
@@ -837,7 +837,7 @@
           <w:szCs w:val="18"/>
         </w:rPr>
         <w:pict w14:anchorId="398BEFEB">
-          <v:rect id="_x0000_s1030" style="position:absolute;margin-left:324pt;margin-top:0;width:3in;height:.95pt;z-index:-251660288;mso-position-horizontal-relative:page" o:allowincell="f" fillcolor="black" stroked="f" strokeweight="0">
+          <v:rect id="_x0000_s1030" style="position:absolute;margin-left:324pt;margin-top:0;width:3in;height:.95pt;z-index:-4;mso-position-horizontal-relative:page" o:allowincell="f" fillcolor="black" stroked="f" strokeweight="0">
             <v:fill color2="black"/>
             <w10:wrap anchorx="page"/>
             <w10:anchorlock/>
@@ -1280,6 +1280,7 @@
       <w:pPr>
         <w:ind w:left="720" w:hanging="720"/>
         <w:rPr>
+          <w:noProof/>
           <w:sz w:val="24"/>
         </w:rPr>
       </w:pPr>
@@ -1297,12 +1298,159 @@
         <w:tab/>
         <w:t>Notice to File Corrected Application Papers (1pg.)</w:t>
       </w:r>
-      <w:r>
-        <w:rPr>
-          <w:noProof/>
-          <w:sz w:val="24"/>
-        </w:rPr>
-        <w:t>&lt;&lt;buildList&gt;&gt;</w:t>
+    </w:p>
+    <w:p>
+      <w:pPr>
+        <w:rPr>
+          <w:sz w:val="24"/>
+        </w:rPr>
+      </w:pPr>
+      <w:r>
+        <w:rPr>
+          <w:sz w:val="24"/>
+          <w:u w:val="single"/>
+        </w:rPr>
+        <w:t>&lt;&lt;</w:t>
+      </w:r>
+      <w:r>
+        <w:rPr>
+          <w:sz w:val="24"/>
+          <w:u w:val="single"/>
+        </w:rPr>
+        <w:t>S</w:t>
+      </w:r>
+      <w:r>
+        <w:rPr>
+          <w:sz w:val="24"/>
+          <w:u w:val="single"/>
+        </w:rPr>
+        <w:t>ubX&gt;&gt;</w:t>
+      </w:r>
+      <w:r>
+        <w:rPr>
+          <w:sz w:val="24"/>
+        </w:rPr>
+        <w:tab/>
+      </w:r>
+      <w:r>
+        <w:rPr>
+          <w:sz w:val="24"/>
+        </w:rPr>
+        <w:t>&lt;&lt;</w:t>
+      </w:r>
+      <w:r>
+        <w:rPr>
+          <w:sz w:val="24"/>
+        </w:rPr>
+        <w:t>Substitute</w:t>
+      </w:r>
+      <w:r>
+        <w:rPr>
+          <w:sz w:val="24"/>
+        </w:rPr>
+        <w:t>Pg&gt;&gt;</w:t>
+      </w:r>
+    </w:p>
+    <w:p>
+      <w:pPr>
+        <w:rPr>
+          <w:sz w:val="24"/>
+        </w:rPr>
+      </w:pPr>
+      <w:r>
+        <w:rPr>
+          <w:sz w:val="24"/>
+          <w:u w:val="single"/>
+        </w:rPr>
+        <w:t>&lt;&lt;AbsX&gt;&gt;</w:t>
+      </w:r>
+      <w:r>
+        <w:rPr>
+          <w:sz w:val="24"/>
+        </w:rPr>
+        <w:tab/>
+      </w:r>
+      <w:r>
+        <w:rPr>
+          <w:sz w:val="24"/>
+        </w:rPr>
+        <w:t>&lt;&lt;</w:t>
+      </w:r>
+      <w:r>
+        <w:rPr>
+          <w:sz w:val="24"/>
+        </w:rPr>
+        <w:t>Abstract</w:t>
+      </w:r>
+      <w:r>
+        <w:rPr>
+          <w:sz w:val="24"/>
+        </w:rPr>
+        <w:t>Pg&gt;&gt;</w:t>
+      </w:r>
+    </w:p>
+    <w:p>
+      <w:pPr>
+        <w:rPr>
+          <w:sz w:val="24"/>
+        </w:rPr>
+      </w:pPr>
+      <w:r>
+        <w:rPr>
+          <w:sz w:val="24"/>
+          <w:u w:val="single"/>
+        </w:rPr>
+        <w:t>&lt;&lt;SeqX&gt;&gt;</w:t>
+      </w:r>
+      <w:r>
+        <w:rPr>
+          <w:sz w:val="24"/>
+        </w:rPr>
+        <w:tab/>
+      </w:r>
+      <w:r>
+        <w:rPr>
+          <w:sz w:val="24"/>
+        </w:rPr>
+        <w:t>&lt;&lt;SeqPg&gt;&gt;</w:t>
+      </w:r>
+    </w:p>
+    <w:p>
+      <w:pPr>
+        <w:rPr>
+          <w:sz w:val="24"/>
+        </w:rPr>
+      </w:pPr>
+      <w:r>
+        <w:rPr>
+          <w:sz w:val="24"/>
+          <w:u w:val="single"/>
+        </w:rPr>
+        <w:t>&lt;&lt;FrmlX&gt;&gt;</w:t>
+      </w:r>
+      <w:r>
+        <w:rPr>
+          <w:sz w:val="24"/>
+        </w:rPr>
+        <w:tab/>
+      </w:r>
+      <w:r>
+        <w:rPr>
+          <w:sz w:val="24"/>
+        </w:rPr>
+        <w:t>&lt;&lt;</w:t>
+      </w:r>
+      <w:r>
+        <w:rPr>
+          <w:sz w:val="24"/>
+        </w:rPr>
+        <w:t>Formal</w:t>
+      </w:r>
+      <w:r>
+        <w:rPr>
+          <w:sz w:val="24"/>
+        </w:rPr>
+        <w:t>Pg&gt;&gt;</w:t>
       </w:r>
     </w:p>
     <w:p>
@@ -1312,25 +1460,6 @@
           <w:sz w:val="24"/>
         </w:rPr>
       </w:pPr>
-      <w:r>
-        <w:rPr>
-          <w:sz w:val="24"/>
-          <w:u w:val="single"/>
-        </w:rPr>
-        <w:t>X</w:t>
-      </w:r>
-      <w:r>
-        <w:rPr>
-          <w:sz w:val="24"/>
-        </w:rPr>
-        <w:tab/>
-      </w:r>
-      <w:r>
-        <w:rPr>
-          <w:sz w:val="24"/>
-        </w:rPr>
-        <w:t>Return Postcard.</w:t>
-      </w:r>
     </w:p>
     <w:p>
       <w:pPr>
@@ -1339,12 +1468,6 @@
           <w:sz w:val="24"/>
         </w:rPr>
       </w:pPr>
-      <w:r>
-        <w:rPr>
-          <w:sz w:val="24"/>
-        </w:rPr>
-        <w:t xml:space="preserve"> </w:t>
-      </w:r>
     </w:p>
     <w:p>
       <w:pPr>
@@ -1358,22 +1481,40 @@
           <w:bCs/>
           <w:szCs w:val="20"/>
         </w:rPr>
-        <w:t xml:space="preserve">If not provided for in a separate paper filed herewith, please consider this a PETITION FOR EXTENSION OF TIME for sufficient number of months to enter these papers and please charge any additional required fees or credit overpayment to Deposit Account No. </w:t>
-      </w:r>
+        <w:t xml:space="preserve">If not provided for in a separate paper filed herewith, please consider this a PETITION FOR EXTENSION OF TIME for </w:t>
+      </w:r>
+      <w:proofErr w:type="gramStart"/>
       <w:r>
         <w:rPr>
           <w:b/>
           <w:bCs/>
           <w:szCs w:val="20"/>
         </w:rPr>
-        <w:t>&lt;&lt;depAccount&gt;&gt;</w:t>
-      </w:r>
+        <w:t>sufficient number of</w:t>
+      </w:r>
+      <w:proofErr w:type="gramEnd"/>
       <w:r>
         <w:rPr>
           <w:b/>
           <w:bCs/>
           <w:szCs w:val="20"/>
         </w:rPr>
+        <w:t xml:space="preserve"> months to enter these papers and please charge any additional required fees or credit overpayment to Deposit Account No. </w:t>
+      </w:r>
+      <w:r>
+        <w:rPr>
+          <w:b/>
+          <w:bCs/>
+          <w:szCs w:val="20"/>
+        </w:rPr>
+        <w:t>&lt;&lt;depAccount&gt;&gt;</w:t>
+      </w:r>
+      <w:r>
+        <w:rPr>
+          <w:b/>
+          <w:bCs/>
+          <w:szCs w:val="20"/>
+        </w:rPr>
         <w:t>.</w:t>
       </w:r>
     </w:p>
@@ -1629,55 +1770,6 @@
         <w:rPr>
           <w:sz w:val="18"/>
           <w:szCs w:val="18"/>
-        </w:rPr>
-      </w:pPr>
-      <w:r>
-        <w:rPr>
-          <w:noProof/>
-          <w:sz w:val="18"/>
-          <w:szCs w:val="18"/>
-        </w:rPr>
-        <w:pict w14:anchorId="487FE94E">
-          <v:line id="_x0000_s1033" style="position:absolute;z-index:251659264" from="1.05pt,.1pt" to="211.05pt,.1pt"/>
-        </w:pict>
-      </w:r>
-      <w:r>
-        <w:rPr>
-          <w:noProof/>
-          <w:sz w:val="18"/>
-          <w:szCs w:val="18"/>
-        </w:rPr>
-        <w:pict w14:anchorId="6E26347E">
-          <v:rect id="_x0000_s1032" style="position:absolute;margin-left:324pt;margin-top:0;width:3in;height:.95pt;z-index:-251658240;mso-position-horizontal-relative:page" o:allowincell="f" fillcolor="black" stroked="f" strokeweight="0">
-            <v:fill color2="black"/>
-            <w10:wrap anchorx="page"/>
-            <w10:anchorlock/>
-          </v:rect>
-        </w:pict>
-      </w:r>
-      <w:r>
-        <w:rPr>
-          <w:sz w:val="18"/>
-          <w:szCs w:val="18"/>
-        </w:rPr>
-        <w:t>Name</w:t>
-      </w:r>
-      <w:r>
-        <w:rPr>
-          <w:sz w:val="18"/>
-          <w:szCs w:val="18"/>
-        </w:rPr>
-        <w:tab/>
-        <w:t>Signature</w:t>
-      </w:r>
-    </w:p>
-    <w:p>
-      <w:pPr>
-        <w:tabs>
-          <w:tab w:val="left" w:pos="5040"/>
-        </w:tabs>
-        <w:rPr>
-          <w:sz w:val="24"/>
         </w:rPr>
         <w:sectPr>
           <w:endnotePr>
@@ -1690,6 +1782,45 @@
           <w:noEndnote/>
         </w:sectPr>
       </w:pPr>
+      <w:r>
+        <w:rPr>
+          <w:noProof/>
+          <w:sz w:val="18"/>
+          <w:szCs w:val="18"/>
+        </w:rPr>
+        <w:pict w14:anchorId="487FE94E">
+          <v:line id="_x0000_s1033" style="position:absolute;z-index:4" from="1.05pt,.1pt" to="211.05pt,.1pt"/>
+        </w:pict>
+      </w:r>
+      <w:r>
+        <w:rPr>
+          <w:noProof/>
+          <w:sz w:val="18"/>
+          <w:szCs w:val="18"/>
+        </w:rPr>
+        <w:pict w14:anchorId="6E26347E">
+          <v:rect id="_x0000_s1032" style="position:absolute;margin-left:324pt;margin-top:0;width:3in;height:.95pt;z-index:-2;mso-position-horizontal-relative:page" o:allowincell="f" fillcolor="black" stroked="f" strokeweight="0">
+            <v:fill color2="black"/>
+            <w10:wrap anchorx="page"/>
+            <w10:anchorlock/>
+          </v:rect>
+        </w:pict>
+      </w:r>
+      <w:r>
+        <w:rPr>
+          <w:sz w:val="18"/>
+          <w:szCs w:val="18"/>
+        </w:rPr>
+        <w:t>Name</w:t>
+      </w:r>
+      <w:r>
+        <w:rPr>
+          <w:sz w:val="18"/>
+          <w:szCs w:val="18"/>
+        </w:rPr>
+        <w:tab/>
+        <w:t>Signature</w:t>
+      </w:r>
     </w:p>
     <w:p/>
     <w:sectPr>
@@ -1779,6 +1910,50 @@
     <w:lsdException w:name="Subtitle" w:qFormat="1"/>
     <w:lsdException w:name="Strong" w:qFormat="1"/>
     <w:lsdException w:name="Emphasis" w:qFormat="1"/>
+    <w:lsdException w:name="Normal Table" w:semiHidden="1" w:unhideWhenUsed="1"/>
+    <w:lsdException w:name="Table Simple 1" w:semiHidden="1" w:unhideWhenUsed="1"/>
+    <w:lsdException w:name="Table Simple 2" w:semiHidden="1" w:unhideWhenUsed="1"/>
+    <w:lsdException w:name="Table Simple 3" w:semiHidden="1" w:unhideWhenUsed="1"/>
+    <w:lsdException w:name="Table Classic 1" w:semiHidden="1" w:unhideWhenUsed="1"/>
+    <w:lsdException w:name="Table Classic 2" w:semiHidden="1" w:unhideWhenUsed="1"/>
+    <w:lsdException w:name="Table Classic 3" w:semiHidden="1" w:unhideWhenUsed="1"/>
+    <w:lsdException w:name="Table Classic 4" w:semiHidden="1" w:unhideWhenUsed="1"/>
+    <w:lsdException w:name="Table Colorful 1" w:semiHidden="1" w:unhideWhenUsed="1"/>
+    <w:lsdException w:name="Table Colorful 2" w:semiHidden="1" w:unhideWhenUsed="1"/>
+    <w:lsdException w:name="Table Colorful 3" w:semiHidden="1" w:unhideWhenUsed="1"/>
+    <w:lsdException w:name="Table Columns 1" w:semiHidden="1" w:unhideWhenUsed="1"/>
+    <w:lsdException w:name="Table Columns 2" w:semiHidden="1" w:unhideWhenUsed="1"/>
+    <w:lsdException w:name="Table Columns 3" w:semiHidden="1" w:unhideWhenUsed="1"/>
+    <w:lsdException w:name="Table Columns 4" w:semiHidden="1" w:unhideWhenUsed="1"/>
+    <w:lsdException w:name="Table Columns 5" w:semiHidden="1" w:unhideWhenUsed="1"/>
+    <w:lsdException w:name="Table Grid 1" w:semiHidden="1" w:unhideWhenUsed="1"/>
+    <w:lsdException w:name="Table Grid 2" w:semiHidden="1" w:unhideWhenUsed="1"/>
+    <w:lsdException w:name="Table Grid 3" w:semiHidden="1" w:unhideWhenUsed="1"/>
+    <w:lsdException w:name="Table Grid 4" w:semiHidden="1" w:unhideWhenUsed="1"/>
+    <w:lsdException w:name="Table Grid 5" w:semiHidden="1" w:unhideWhenUsed="1"/>
+    <w:lsdException w:name="Table Grid 6" w:semiHidden="1" w:unhideWhenUsed="1"/>
+    <w:lsdException w:name="Table Grid 7" w:semiHidden="1" w:unhideWhenUsed="1"/>
+    <w:lsdException w:name="Table Grid 8" w:semiHidden="1" w:unhideWhenUsed="1"/>
+    <w:lsdException w:name="Table List 1" w:semiHidden="1" w:unhideWhenUsed="1"/>
+    <w:lsdException w:name="Table List 2" w:semiHidden="1" w:unhideWhenUsed="1"/>
+    <w:lsdException w:name="Table List 3" w:semiHidden="1" w:unhideWhenUsed="1"/>
+    <w:lsdException w:name="Table List 4" w:semiHidden="1" w:unhideWhenUsed="1"/>
+    <w:lsdException w:name="Table List 5" w:semiHidden="1" w:unhideWhenUsed="1"/>
+    <w:lsdException w:name="Table List 6" w:semiHidden="1" w:unhideWhenUsed="1"/>
+    <w:lsdException w:name="Table List 7" w:semiHidden="1" w:unhideWhenUsed="1"/>
+    <w:lsdException w:name="Table List 8" w:semiHidden="1" w:unhideWhenUsed="1"/>
+    <w:lsdException w:name="Table 3D effects 1" w:semiHidden="1" w:unhideWhenUsed="1"/>
+    <w:lsdException w:name="Table 3D effects 2" w:semiHidden="1" w:unhideWhenUsed="1"/>
+    <w:lsdException w:name="Table 3D effects 3" w:semiHidden="1" w:unhideWhenUsed="1"/>
+    <w:lsdException w:name="Table Contemporary" w:semiHidden="1" w:unhideWhenUsed="1"/>
+    <w:lsdException w:name="Table Elegant" w:semiHidden="1" w:unhideWhenUsed="1"/>
+    <w:lsdException w:name="Table Professional" w:semiHidden="1" w:unhideWhenUsed="1"/>
+    <w:lsdException w:name="Table Subtle 1" w:semiHidden="1" w:unhideWhenUsed="1"/>
+    <w:lsdException w:name="Table Subtle 2" w:semiHidden="1" w:unhideWhenUsed="1"/>
+    <w:lsdException w:name="Table Web 1" w:semiHidden="1" w:unhideWhenUsed="1"/>
+    <w:lsdException w:name="Table Web 2" w:semiHidden="1" w:unhideWhenUsed="1"/>
+    <w:lsdException w:name="Table Web 3" w:semiHidden="1" w:unhideWhenUsed="1"/>
+    <w:lsdException w:name="Table Theme" w:semiHidden="1" w:unhideWhenUsed="1"/>
     <w:lsdException w:name="Placeholder Text" w:semiHidden="1" w:uiPriority="99"/>
     <w:lsdException w:name="No Spacing" w:uiPriority="1" w:qFormat="1"/>
     <w:lsdException w:name="Light Shading" w:uiPriority="60"/>
@@ -2051,11 +2226,15 @@
   </w:style>
   <w:style w:type="character" w:default="1" w:styleId="DefaultParagraphFont">
     <w:name w:val="Default Paragraph Font"/>
+    <w:uiPriority w:val="1"/>
     <w:semiHidden/>
+    <w:unhideWhenUsed/>
   </w:style>
   <w:style w:type="table" w:default="1" w:styleId="TableNormal">
     <w:name w:val="Normal Table"/>
+    <w:uiPriority w:val="99"/>
     <w:semiHidden/>
+    <w:unhideWhenUsed/>
     <w:tblPr>
       <w:tblInd w:w="0" w:type="dxa"/>
       <w:tblCellMar>
@@ -2068,7 +2247,9 @@
   </w:style>
   <w:style w:type="numbering" w:default="1" w:styleId="NoList">
     <w:name w:val="No List"/>
+    <w:uiPriority w:val="99"/>
     <w:semiHidden/>
+    <w:unhideWhenUsed/>
   </w:style>
   <w:style w:type="character" w:styleId="FootnoteReference">
     <w:name w:val="footnote reference"/>

</xml_diff>

<commit_message>
Worked on 'issuefee' and 'stateofallw' merge functions
</commit_message>
<xml_diff>
--- a/project/documents/communications/corrappln.docx
+++ b/project/documents/communications/corrappln.docx
@@ -87,7 +87,14 @@
         <w:rPr>
           <w:sz w:val="24"/>
         </w:rPr>
-        <w:t>Inventor(s):     &lt;&lt;inventorEtal&gt;&gt;</w:t>
+        <w:t>Inventor(s):</w:t>
+      </w:r>
+      <w:r>
+        <w:rPr>
+          <w:sz w:val="24"/>
+        </w:rPr>
+        <w:tab/>
+        <w:t>&lt;&lt;inventorEtal&gt;&gt;</w:t>
       </w:r>
       <w:r>
         <w:rPr>
@@ -411,7 +418,13 @@
         <w:rPr>
           <w:sz w:val="24"/>
         </w:rPr>
-        <w:t xml:space="preserve">application (see attached copy). </w:t>
+        <w:t>application (see attached copy).</w:t>
+      </w:r>
+      <w:r>
+        <w:rPr>
+          <w:sz w:val="24"/>
+        </w:rPr>
+        <w:t xml:space="preserve"> </w:t>
       </w:r>
       <w:r>
         <w:rPr>
@@ -419,6 +432,18 @@
           <w:sz w:val="24"/>
         </w:rPr>
         <w:t>&lt;&lt;docList&gt;&gt;</w:t>
+      </w:r>
+      <w:r>
+        <w:rPr>
+          <w:sz w:val="24"/>
+        </w:rPr>
+        <w:t xml:space="preserve"> </w:t>
+      </w:r>
+      <w:r>
+        <w:rPr>
+          <w:sz w:val="24"/>
+        </w:rPr>
+        <w:t>It is further submitted that no new matter is represented with response hereto.</w:t>
       </w:r>
     </w:p>
     <w:p>
@@ -646,6 +671,12 @@
         <w:rPr>
           <w:sz w:val="24"/>
         </w:rPr>
+        <w:tab/>
+      </w:r>
+      <w:r>
+        <w:rPr>
+          <w:sz w:val="24"/>
+        </w:rPr>
         <w:t>&lt;&lt;echoSignature&gt;&gt;</w:t>
       </w:r>
     </w:p>
@@ -755,110 +786,6 @@
           <w:sz w:val="24"/>
         </w:rPr>
       </w:pPr>
-    </w:p>
-    <w:p>
-      <w:pPr>
-        <w:rPr>
-          <w:sz w:val="18"/>
-          <w:szCs w:val="18"/>
-        </w:rPr>
-      </w:pPr>
-      <w:r>
-        <w:rPr>
-          <w:sz w:val="18"/>
-          <w:szCs w:val="18"/>
-          <w:u w:val="single"/>
-        </w:rPr>
-        <w:t>CERTIFICATE UNDER 37 CFR 1.8</w:t>
-      </w:r>
-      <w:r>
-        <w:rPr>
-          <w:sz w:val="18"/>
-          <w:szCs w:val="18"/>
-        </w:rPr>
-        <w:t xml:space="preserve">:  The undersigned hereby certifies that this correspondence is being &lt;&lt;certificateText&gt;&gt; addressed to:  Mail Stop PGPUB, Commissioner for Patents, P.O. Box 1450, Alexandria, VA 22313-1450 on this </w:t>
-      </w:r>
-      <w:r>
-        <w:rPr>
-          <w:sz w:val="18"/>
-          <w:szCs w:val="18"/>
-          <w:u w:val="single"/>
-        </w:rPr>
-        <w:t xml:space="preserve">          </w:t>
-      </w:r>
-      <w:r>
-        <w:rPr>
-          <w:sz w:val="18"/>
-          <w:szCs w:val="18"/>
-        </w:rPr>
-        <w:t xml:space="preserve"> day of &lt;&lt;currentMo&gt;&gt;, &lt;&lt;currentYr&gt;&gt;.</w:t>
-      </w:r>
-    </w:p>
-    <w:p>
-      <w:pPr>
-        <w:rPr>
-          <w:sz w:val="18"/>
-          <w:szCs w:val="18"/>
-        </w:rPr>
-      </w:pPr>
-    </w:p>
-    <w:p>
-      <w:pPr>
-        <w:rPr>
-          <w:sz w:val="18"/>
-          <w:szCs w:val="18"/>
-        </w:rPr>
-      </w:pPr>
-    </w:p>
-    <w:p>
-      <w:pPr>
-        <w:tabs>
-          <w:tab w:val="left" w:pos="5040"/>
-        </w:tabs>
-        <w:rPr>
-          <w:sz w:val="18"/>
-          <w:szCs w:val="18"/>
-        </w:rPr>
-      </w:pPr>
-      <w:r>
-        <w:rPr>
-          <w:noProof/>
-          <w:sz w:val="18"/>
-          <w:szCs w:val="18"/>
-        </w:rPr>
-        <w:pict w14:anchorId="1942FA60">
-          <v:line id="_x0000_s1031" style="position:absolute;z-index:2" from="1.05pt,.1pt" to="211.05pt,.1pt"/>
-        </w:pict>
-      </w:r>
-      <w:r>
-        <w:rPr>
-          <w:noProof/>
-          <w:sz w:val="18"/>
-          <w:szCs w:val="18"/>
-        </w:rPr>
-        <w:pict w14:anchorId="398BEFEB">
-          <v:rect id="_x0000_s1030" style="position:absolute;margin-left:324pt;margin-top:0;width:3in;height:.95pt;z-index:-4;mso-position-horizontal-relative:page" o:allowincell="f" fillcolor="black" stroked="f" strokeweight="0">
-            <v:fill color2="black"/>
-            <w10:wrap anchorx="page"/>
-            <w10:anchorlock/>
-          </v:rect>
-        </w:pict>
-      </w:r>
-      <w:r>
-        <w:rPr>
-          <w:sz w:val="18"/>
-          <w:szCs w:val="18"/>
-        </w:rPr>
-        <w:t>Name</w:t>
-      </w:r>
-      <w:r>
-        <w:rPr>
-          <w:sz w:val="18"/>
-          <w:szCs w:val="18"/>
-        </w:rPr>
-        <w:tab/>
-        <w:t>Signature</w:t>
-      </w:r>
     </w:p>
     <w:p>
       <w:pPr>
@@ -1256,7 +1183,6 @@
     </w:p>
     <w:p>
       <w:pPr>
-        <w:ind w:left="720" w:hanging="720"/>
         <w:rPr>
           <w:sz w:val="24"/>
         </w:rPr>
@@ -1278,7 +1204,6 @@
     </w:p>
     <w:p>
       <w:pPr>
-        <w:ind w:left="720" w:hanging="720"/>
         <w:rPr>
           <w:noProof/>
           <w:sz w:val="24"/>
@@ -1310,45 +1235,56 @@
           <w:sz w:val="24"/>
           <w:u w:val="single"/>
         </w:rPr>
-        <w:t>&lt;&lt;</w:t>
-      </w:r>
+        <w:t>&lt;&lt;SubX&gt;&gt;</w:t>
+      </w:r>
+      <w:r>
+        <w:rPr>
+          <w:sz w:val="24"/>
+        </w:rPr>
+        <w:tab/>
+        <w:t>&lt;&lt;SubstitutePg&gt;&gt;</w:t>
+      </w:r>
+    </w:p>
+    <w:p>
+      <w:pPr>
+        <w:rPr>
+          <w:sz w:val="24"/>
+        </w:rPr>
+      </w:pPr>
       <w:r>
         <w:rPr>
           <w:sz w:val="24"/>
           <w:u w:val="single"/>
         </w:rPr>
-        <w:t>S</w:t>
-      </w:r>
+        <w:t>&lt;&lt;AbsX&gt;&gt;</w:t>
+      </w:r>
+      <w:r>
+        <w:rPr>
+          <w:sz w:val="24"/>
+        </w:rPr>
+        <w:tab/>
+        <w:t>&lt;&lt;AbstractPg&gt;&gt;</w:t>
+      </w:r>
+    </w:p>
+    <w:p>
+      <w:pPr>
+        <w:rPr>
+          <w:sz w:val="24"/>
+        </w:rPr>
+      </w:pPr>
       <w:r>
         <w:rPr>
           <w:sz w:val="24"/>
           <w:u w:val="single"/>
         </w:rPr>
-        <w:t>ubX&gt;&gt;</w:t>
-      </w:r>
-      <w:r>
-        <w:rPr>
-          <w:sz w:val="24"/>
-        </w:rPr>
-        <w:tab/>
-      </w:r>
-      <w:r>
-        <w:rPr>
-          <w:sz w:val="24"/>
-        </w:rPr>
-        <w:t>&lt;&lt;</w:t>
-      </w:r>
-      <w:r>
-        <w:rPr>
-          <w:sz w:val="24"/>
-        </w:rPr>
-        <w:t>Substitute</w:t>
-      </w:r>
-      <w:r>
-        <w:rPr>
-          <w:sz w:val="24"/>
-        </w:rPr>
-        <w:t>Pg&gt;&gt;</w:t>
+        <w:t>&lt;&lt;SeqX&gt;&gt;</w:t>
+      </w:r>
+      <w:r>
+        <w:rPr>
+          <w:sz w:val="24"/>
+        </w:rPr>
+        <w:tab/>
+        <w:t>&lt;&lt;SeqPg&gt;&gt;</w:t>
       </w:r>
     </w:p>
     <w:p>
@@ -1362,70 +1298,6 @@
           <w:sz w:val="24"/>
           <w:u w:val="single"/>
         </w:rPr>
-        <w:t>&lt;&lt;AbsX&gt;&gt;</w:t>
-      </w:r>
-      <w:r>
-        <w:rPr>
-          <w:sz w:val="24"/>
-        </w:rPr>
-        <w:tab/>
-      </w:r>
-      <w:r>
-        <w:rPr>
-          <w:sz w:val="24"/>
-        </w:rPr>
-        <w:t>&lt;&lt;</w:t>
-      </w:r>
-      <w:r>
-        <w:rPr>
-          <w:sz w:val="24"/>
-        </w:rPr>
-        <w:t>Abstract</w:t>
-      </w:r>
-      <w:r>
-        <w:rPr>
-          <w:sz w:val="24"/>
-        </w:rPr>
-        <w:t>Pg&gt;&gt;</w:t>
-      </w:r>
-    </w:p>
-    <w:p>
-      <w:pPr>
-        <w:rPr>
-          <w:sz w:val="24"/>
-        </w:rPr>
-      </w:pPr>
-      <w:r>
-        <w:rPr>
-          <w:sz w:val="24"/>
-          <w:u w:val="single"/>
-        </w:rPr>
-        <w:t>&lt;&lt;SeqX&gt;&gt;</w:t>
-      </w:r>
-      <w:r>
-        <w:rPr>
-          <w:sz w:val="24"/>
-        </w:rPr>
-        <w:tab/>
-      </w:r>
-      <w:r>
-        <w:rPr>
-          <w:sz w:val="24"/>
-        </w:rPr>
-        <w:t>&lt;&lt;SeqPg&gt;&gt;</w:t>
-      </w:r>
-    </w:p>
-    <w:p>
-      <w:pPr>
-        <w:rPr>
-          <w:sz w:val="24"/>
-        </w:rPr>
-      </w:pPr>
-      <w:r>
-        <w:rPr>
-          <w:sz w:val="24"/>
-          <w:u w:val="single"/>
-        </w:rPr>
         <w:t>&lt;&lt;FrmlX&gt;&gt;</w:t>
       </w:r>
       <w:r>
@@ -1433,37 +1305,18 @@
           <w:sz w:val="24"/>
         </w:rPr>
         <w:tab/>
-      </w:r>
-      <w:r>
-        <w:rPr>
-          <w:sz w:val="24"/>
-        </w:rPr>
-        <w:t>&lt;&lt;</w:t>
-      </w:r>
-      <w:r>
-        <w:rPr>
-          <w:sz w:val="24"/>
-        </w:rPr>
-        <w:t>Formal</w:t>
-      </w:r>
-      <w:r>
-        <w:rPr>
-          <w:sz w:val="24"/>
-        </w:rPr>
-        <w:t>Pg&gt;&gt;</w:t>
-      </w:r>
-    </w:p>
-    <w:p>
-      <w:pPr>
-        <w:ind w:left="720" w:hanging="720"/>
-        <w:rPr>
-          <w:sz w:val="24"/>
-        </w:rPr>
-      </w:pPr>
-    </w:p>
-    <w:p>
-      <w:pPr>
-        <w:ind w:left="720" w:hanging="720"/>
+        <w:t>&lt;&lt;FormalPg&gt;&gt;</w:t>
+      </w:r>
+    </w:p>
+    <w:p>
+      <w:pPr>
+        <w:rPr>
+          <w:sz w:val="24"/>
+        </w:rPr>
+      </w:pPr>
+    </w:p>
+    <w:p>
+      <w:pPr>
         <w:rPr>
           <w:sz w:val="24"/>
         </w:rPr>
@@ -1481,40 +1334,22 @@
           <w:bCs/>
           <w:szCs w:val="20"/>
         </w:rPr>
-        <w:t xml:space="preserve">If not provided for in a separate paper filed herewith, please consider this a PETITION FOR EXTENSION OF TIME for </w:t>
-      </w:r>
-      <w:proofErr w:type="gramStart"/>
+        <w:t xml:space="preserve">If not provided for in a separate paper filed herewith, please consider this a PETITION FOR EXTENSION OF TIME for sufficient number of months to enter these papers and please charge any additional required fees or credit overpayment to Deposit Account No. </w:t>
+      </w:r>
       <w:r>
         <w:rPr>
           <w:b/>
           <w:bCs/>
           <w:szCs w:val="20"/>
         </w:rPr>
-        <w:t>sufficient number of</w:t>
-      </w:r>
-      <w:proofErr w:type="gramEnd"/>
+        <w:t>&lt;&lt;depAccount&gt;&gt;</w:t>
+      </w:r>
       <w:r>
         <w:rPr>
           <w:b/>
           <w:bCs/>
           <w:szCs w:val="20"/>
         </w:rPr>
-        <w:t xml:space="preserve"> months to enter these papers and please charge any additional required fees or credit overpayment to Deposit Account No. </w:t>
-      </w:r>
-      <w:r>
-        <w:rPr>
-          <w:b/>
-          <w:bCs/>
-          <w:szCs w:val="20"/>
-        </w:rPr>
-        <w:t>&lt;&lt;depAccount&gt;&gt;</w:t>
-      </w:r>
-      <w:r>
-        <w:rPr>
-          <w:b/>
-          <w:bCs/>
-          <w:szCs w:val="20"/>
-        </w:rPr>
         <w:t>.</w:t>
       </w:r>
     </w:p>
@@ -1708,128 +1543,13 @@
         </w:rPr>
       </w:pPr>
     </w:p>
-    <w:p>
-      <w:pPr>
-        <w:rPr>
-          <w:sz w:val="18"/>
-          <w:szCs w:val="18"/>
-        </w:rPr>
-      </w:pPr>
-      <w:r>
-        <w:rPr>
-          <w:sz w:val="18"/>
-          <w:szCs w:val="18"/>
-          <w:u w:val="single"/>
-        </w:rPr>
-        <w:t>CERTIFICATE UNDER 37 CFR 1.8</w:t>
-      </w:r>
-      <w:r>
-        <w:rPr>
-          <w:sz w:val="18"/>
-          <w:szCs w:val="18"/>
-        </w:rPr>
-        <w:t xml:space="preserve">:  The undersigned hereby certifies that this correspondence is being &lt;&lt;certificateText&gt;&gt; addressed to:  Mail Stop PGPUB, Commissioner for Patents, P.O. Box 1450, Alexandria, VA 22313-1450 on this </w:t>
-      </w:r>
-      <w:r>
-        <w:rPr>
-          <w:sz w:val="18"/>
-          <w:szCs w:val="18"/>
-          <w:u w:val="single"/>
-        </w:rPr>
-        <w:t xml:space="preserve">          </w:t>
-      </w:r>
-      <w:r>
-        <w:rPr>
-          <w:sz w:val="18"/>
-          <w:szCs w:val="18"/>
-        </w:rPr>
-        <w:t xml:space="preserve"> day of &lt;&lt;currentMo&gt;&gt;, &lt;&lt;currentYr&gt;&gt;.</w:t>
-      </w:r>
-    </w:p>
-    <w:p>
-      <w:pPr>
-        <w:rPr>
-          <w:sz w:val="18"/>
-          <w:szCs w:val="18"/>
-        </w:rPr>
-      </w:pPr>
-    </w:p>
-    <w:p>
-      <w:pPr>
-        <w:rPr>
-          <w:sz w:val="18"/>
-          <w:szCs w:val="18"/>
-        </w:rPr>
-      </w:pPr>
-    </w:p>
-    <w:p>
-      <w:pPr>
-        <w:tabs>
-          <w:tab w:val="left" w:pos="5040"/>
-        </w:tabs>
-        <w:rPr>
-          <w:sz w:val="18"/>
-          <w:szCs w:val="18"/>
-        </w:rPr>
-        <w:sectPr>
-          <w:endnotePr>
-            <w:numFmt w:val="decimal"/>
-          </w:endnotePr>
-          <w:pgSz w:w="12240" w:h="15840" w:code="1"/>
-          <w:pgMar w:top="720" w:right="720" w:bottom="1440" w:left="720" w:header="720" w:footer="1440" w:gutter="0"/>
-          <w:paperSrc w:first="7" w:other="7"/>
-          <w:cols w:space="720"/>
-          <w:noEndnote/>
-        </w:sectPr>
-      </w:pPr>
-      <w:r>
-        <w:rPr>
-          <w:noProof/>
-          <w:sz w:val="18"/>
-          <w:szCs w:val="18"/>
-        </w:rPr>
-        <w:pict w14:anchorId="487FE94E">
-          <v:line id="_x0000_s1033" style="position:absolute;z-index:4" from="1.05pt,.1pt" to="211.05pt,.1pt"/>
-        </w:pict>
-      </w:r>
-      <w:r>
-        <w:rPr>
-          <w:noProof/>
-          <w:sz w:val="18"/>
-          <w:szCs w:val="18"/>
-        </w:rPr>
-        <w:pict w14:anchorId="6E26347E">
-          <v:rect id="_x0000_s1032" style="position:absolute;margin-left:324pt;margin-top:0;width:3in;height:.95pt;z-index:-2;mso-position-horizontal-relative:page" o:allowincell="f" fillcolor="black" stroked="f" strokeweight="0">
-            <v:fill color2="black"/>
-            <w10:wrap anchorx="page"/>
-            <w10:anchorlock/>
-          </v:rect>
-        </w:pict>
-      </w:r>
-      <w:r>
-        <w:rPr>
-          <w:sz w:val="18"/>
-          <w:szCs w:val="18"/>
-        </w:rPr>
-        <w:t>Name</w:t>
-      </w:r>
-      <w:r>
-        <w:rPr>
-          <w:sz w:val="18"/>
-          <w:szCs w:val="18"/>
-        </w:rPr>
-        <w:tab/>
-        <w:t>Signature</w:t>
-      </w:r>
-    </w:p>
-    <w:p/>
     <w:sectPr>
       <w:endnotePr>
         <w:numFmt w:val="decimal"/>
       </w:endnotePr>
-      <w:pgSz w:w="13680" w:h="5940" w:orient="landscape" w:code="20"/>
-      <w:pgMar w:top="907" w:right="3456" w:bottom="907" w:left="3456" w:header="907" w:footer="907" w:gutter="0"/>
-      <w:paperSrc w:first="5" w:other="5"/>
+      <w:pgSz w:w="12240" w:h="15840" w:code="1"/>
+      <w:pgMar w:top="720" w:right="720" w:bottom="1440" w:left="720" w:header="720" w:footer="1440" w:gutter="0"/>
+      <w:paperSrc w:first="7" w:other="7"/>
       <w:cols w:space="720"/>
       <w:noEndnote/>
     </w:sectPr>

</xml_diff>